<commit_message>
Point the customs primer, brief template and model guide at videos 3-4
Co-Authored-By: Claude Fable 5.1 <noreply@anthropic.com>
Claude-Session: https://claude.ai/code/session_01HYPr12gJ7yT998qrKuSZbE
</commit_message>
<xml_diff>
--- a/dist/docs/primers/customs-trade-compliance-primer.docx
+++ b/dist/docs/primers/customs-trade-compliance-primer.docx
@@ -12788,6 +12788,30 @@
       </w:pPr>
       <w:r>
         <w:t xml:space="preserve">10. Origin and USMCA</w:t>
+      </w:r>
+    </w:p>
+    <w:p>
+      <w:pPr>
+        <w:pStyle w:val="FirstParagraph"/>
+      </w:pPr>
+      <w:r>
+        <w:t xml:space="preserve">Watch first: the 2-minute video</w:t>
+      </w:r>
+      <w:r>
+        <w:t xml:space="preserve"> </w:t>
+      </w:r>
+      <w:r>
+        <w:rPr>
+          <w:iCs/>
+          <w:i/>
+        </w:rPr>
+        <w:t xml:space="preserve">Does it qualify? USMCA origin with a bill of materials</w:t>
+      </w:r>
+      <w:r>
+        <w:t xml:space="preserve"> </w:t>
+      </w:r>
+      <w:r>
+        <w:t xml:space="preserve">— [COMPANY: Stream link]. It walks the PK-100 example from Section 10.8 step by step.</w:t>
       </w:r>
     </w:p>
     <w:bookmarkStart w:id="67" w:name="X188b17109956731d88ec121b8eec35c77f92a2a"/>

</xml_diff>